<commit_message>
updated the document template
</commit_message>
<xml_diff>
--- a/docassemble/VTHousingRA/data/templates/reasonable-accomodation-request-letter-to-landlord.docx
+++ b/docassemble/VTHousingRA/data/templates/reasonable-accomodation-request-letter-to-landlord.docx
@@ -10,53 +10,79 @@
         <w:spacing w:after="360"/>
         <w:contextualSpacing/>
         <w:rPr>
-          <w:rFonts w:ascii="Times New Roman" w:hAnsi="Times New Roman" w:cs="Times New Roman"/>
-          <w:color w:val="211D1E"/>
-        </w:rPr>
-      </w:pPr>
-      <w:r>
-        <w:rPr>
-          <w:rFonts w:ascii="Times New Roman" w:hAnsi="Times New Roman" w:cs="Times New Roman"/>
+          <w:rFonts w:ascii="Aptos" w:hAnsi="Aptos" w:cs="Times New Roman"/>
+          <w:color w:val="211D1E"/>
+        </w:rPr>
+      </w:pPr>
+      <w:r>
+        <w:rPr>
+          <w:rFonts w:ascii="Aptos" w:hAnsi="Aptos" w:cs="Times New Roman"/>
           <w:color w:val="211D1E"/>
         </w:rPr>
         <w:t xml:space="preserve">{{ </w:t>
       </w:r>
       <w:r>
         <w:rPr>
-          <w:rFonts w:ascii="Times New Roman" w:hAnsi="Times New Roman" w:cs="Times New Roman"/>
-          <w:color w:val="211D1E"/>
-        </w:rPr>
-        <w:t>users[0].</w:t>
-      </w:r>
-      <w:proofErr w:type="spellStart"/>
-      <w:r>
-        <w:rPr>
-          <w:rFonts w:ascii="Times New Roman" w:hAnsi="Times New Roman" w:cs="Times New Roman"/>
-          <w:color w:val="211D1E"/>
-        </w:rPr>
-        <w:t>address.block</w:t>
-      </w:r>
-      <w:proofErr w:type="spellEnd"/>
-      <w:r>
-        <w:rPr>
-          <w:rFonts w:ascii="Times New Roman" w:hAnsi="Times New Roman" w:cs="Times New Roman"/>
+          <w:rFonts w:ascii="Aptos" w:hAnsi="Aptos" w:cs="Times New Roman"/>
+          <w:color w:val="211D1E"/>
+        </w:rPr>
+        <w:t>users[0].address.line_one</w:t>
+      </w:r>
+      <w:r>
+        <w:rPr>
+          <w:rFonts w:ascii="Aptos" w:hAnsi="Aptos" w:cs="Times New Roman"/>
           <w:color w:val="211D1E"/>
         </w:rPr>
         <w:t>()</w:t>
       </w:r>
       <w:r>
         <w:rPr>
-          <w:rFonts w:ascii="Times New Roman" w:hAnsi="Times New Roman" w:cs="Times New Roman"/>
+          <w:rFonts w:ascii="Aptos" w:hAnsi="Aptos" w:cs="Times New Roman"/>
           <w:color w:val="211D1E"/>
         </w:rPr>
         <w:t xml:space="preserve"> </w:t>
       </w:r>
       <w:r>
         <w:rPr>
-          <w:rFonts w:ascii="Times New Roman" w:hAnsi="Times New Roman" w:cs="Times New Roman"/>
+          <w:rFonts w:ascii="Aptos" w:hAnsi="Aptos" w:cs="Times New Roman"/>
           <w:color w:val="211D1E"/>
         </w:rPr>
         <w:t>}}</w:t>
+      </w:r>
+      <w:r>
+        <w:rPr>
+          <w:rFonts w:ascii="Aptos" w:hAnsi="Aptos" w:cs="Times New Roman"/>
+          <w:color w:val="211D1E"/>
+        </w:rPr>
+        <w:br/>
+      </w:r>
+      <w:r>
+        <w:rPr>
+          <w:rFonts w:ascii="Aptos" w:hAnsi="Aptos" w:cs="Times New Roman"/>
+          <w:color w:val="211D1E"/>
+        </w:rPr>
+        <w:t xml:space="preserve">{{ </w:t>
+      </w:r>
+      <w:r>
+        <w:rPr>
+          <w:rFonts w:ascii="Aptos" w:hAnsi="Aptos" w:cs="Times New Roman"/>
+          <w:color w:val="211D1E"/>
+        </w:rPr>
+        <w:t>users[0].address.line_</w:t>
+      </w:r>
+      <w:r>
+        <w:rPr>
+          <w:rFonts w:ascii="Aptos" w:hAnsi="Aptos" w:cs="Times New Roman"/>
+          <w:color w:val="211D1E"/>
+        </w:rPr>
+        <w:t>two</w:t>
+      </w:r>
+      <w:r>
+        <w:rPr>
+          <w:rFonts w:ascii="Aptos" w:hAnsi="Aptos" w:cs="Times New Roman"/>
+          <w:color w:val="211D1E"/>
+        </w:rPr>
+        <w:t>() }}</w:t>
       </w:r>
     </w:p>
     <w:p>
@@ -67,7 +93,7 @@
         <w:spacing w:after="360"/>
         <w:contextualSpacing/>
         <w:rPr>
-          <w:rFonts w:ascii="Times New Roman" w:hAnsi="Times New Roman" w:cs="Times New Roman"/>
+          <w:rFonts w:ascii="Aptos" w:hAnsi="Aptos" w:cs="Times New Roman"/>
           <w:color w:val="211D1E"/>
         </w:rPr>
       </w:pPr>
@@ -80,32 +106,30 @@
         <w:spacing w:after="360"/>
         <w:contextualSpacing/>
         <w:rPr>
-          <w:rFonts w:ascii="Times New Roman" w:hAnsi="Times New Roman" w:cs="Times New Roman"/>
-          <w:color w:val="211D1E"/>
-        </w:rPr>
-      </w:pPr>
-      <w:r>
-        <w:rPr>
-          <w:rFonts w:ascii="Times New Roman" w:hAnsi="Times New Roman" w:cs="Times New Roman"/>
-          <w:color w:val="211D1E"/>
-        </w:rPr>
-        <w:t xml:space="preserve">{{ </w:t>
-      </w:r>
-      <w:proofErr w:type="spellStart"/>
-      <w:r>
-        <w:rPr>
-          <w:rFonts w:ascii="Times New Roman" w:hAnsi="Times New Roman" w:cs="Times New Roman"/>
-          <w:color w:val="211D1E"/>
-        </w:rPr>
-        <w:t>signature_date</w:t>
-      </w:r>
-      <w:proofErr w:type="spellEnd"/>
-      <w:r>
-        <w:rPr>
-          <w:rFonts w:ascii="Times New Roman" w:hAnsi="Times New Roman" w:cs="Times New Roman"/>
-          <w:color w:val="211D1E"/>
-        </w:rPr>
-        <w:t xml:space="preserve"> }}</w:t>
+          <w:rFonts w:ascii="Aptos" w:hAnsi="Aptos" w:cs="Times New Roman"/>
+          <w:color w:val="211D1E"/>
+        </w:rPr>
+      </w:pPr>
+      <w:r>
+        <w:rPr>
+          <w:rFonts w:ascii="Aptos" w:hAnsi="Aptos" w:cs="Times New Roman"/>
+          <w:color w:val="211D1E"/>
+        </w:rPr>
+        <w:t>{{</w:t>
+      </w:r>
+      <w:r>
+        <w:rPr>
+          <w:rFonts w:ascii="Aptos" w:hAnsi="Aptos" w:cs="Times New Roman"/>
+          <w:color w:val="211D1E"/>
+        </w:rPr>
+        <w:t xml:space="preserve"> today() </w:t>
+      </w:r>
+      <w:r>
+        <w:rPr>
+          <w:rFonts w:ascii="Aptos" w:hAnsi="Aptos" w:cs="Times New Roman"/>
+          <w:color w:val="211D1E"/>
+        </w:rPr>
+        <w:t>}}</w:t>
       </w:r>
     </w:p>
     <w:p>
@@ -116,7 +140,7 @@
         <w:spacing w:after="360"/>
         <w:contextualSpacing/>
         <w:rPr>
-          <w:rFonts w:ascii="Times New Roman" w:hAnsi="Times New Roman" w:cs="Times New Roman"/>
+          <w:rFonts w:ascii="Aptos" w:hAnsi="Aptos" w:cs="Times New Roman"/>
           <w:color w:val="211D1E"/>
         </w:rPr>
       </w:pPr>
@@ -129,15 +153,105 @@
         <w:spacing w:after="360"/>
         <w:contextualSpacing/>
         <w:rPr>
-          <w:rFonts w:ascii="Times New Roman" w:hAnsi="Times New Roman" w:cs="Times New Roman"/>
-          <w:color w:val="211D1E"/>
-        </w:rPr>
-      </w:pPr>
-      <w:r>
+          <w:rFonts w:ascii="Aptos" w:hAnsi="Aptos" w:cs="Times New Roman"/>
+          <w:color w:val="211D1E"/>
+        </w:rPr>
+      </w:pPr>
+      <w:r>
+        <w:rPr>
+          <w:rFonts w:ascii="Aptos" w:hAnsi="Aptos"/>
+        </w:rPr>
         <w:t>{{ landlords[0].name.full() }}</w:t>
+      </w:r>
+      <w:r>
+        <w:rPr>
+          <w:rFonts w:ascii="Aptos" w:hAnsi="Aptos"/>
+        </w:rPr>
         <w:br/>
-        <w:t>{{ landlords[0].address.block() }}</w:t>
-      </w:r>
+      </w:r>
+      <w:r>
+        <w:rPr>
+          <w:rFonts w:ascii="Aptos" w:hAnsi="Aptos" w:cs="Times New Roman"/>
+          <w:color w:val="211D1E"/>
+        </w:rPr>
+        <w:t xml:space="preserve">{{ </w:t>
+      </w:r>
+      <w:r>
+        <w:rPr>
+          <w:rFonts w:ascii="Aptos" w:hAnsi="Aptos" w:cs="Times New Roman"/>
+          <w:color w:val="211D1E"/>
+        </w:rPr>
+        <w:t>landlords</w:t>
+      </w:r>
+      <w:r>
+        <w:rPr>
+          <w:rFonts w:ascii="Aptos" w:hAnsi="Aptos" w:cs="Times New Roman"/>
+          <w:color w:val="211D1E"/>
+        </w:rPr>
+        <w:t>[0].address.line_one</w:t>
+      </w:r>
+      <w:r>
+        <w:rPr>
+          <w:rFonts w:ascii="Aptos" w:hAnsi="Aptos" w:cs="Times New Roman"/>
+          <w:color w:val="211D1E"/>
+        </w:rPr>
+        <w:t>() }}</w:t>
+      </w:r>
+      <w:r>
+        <w:rPr>
+          <w:rFonts w:ascii="Aptos" w:hAnsi="Aptos" w:cs="Times New Roman"/>
+          <w:color w:val="211D1E"/>
+        </w:rPr>
+        <w:br/>
+      </w:r>
+      <w:r>
+        <w:rPr>
+          <w:rFonts w:ascii="Aptos" w:hAnsi="Aptos" w:cs="Times New Roman"/>
+          <w:color w:val="211D1E"/>
+        </w:rPr>
+        <w:t xml:space="preserve">{{ </w:t>
+      </w:r>
+      <w:r>
+        <w:rPr>
+          <w:rFonts w:ascii="Aptos" w:hAnsi="Aptos" w:cs="Times New Roman"/>
+          <w:color w:val="211D1E"/>
+        </w:rPr>
+        <w:t>landlords</w:t>
+      </w:r>
+      <w:r>
+        <w:rPr>
+          <w:rFonts w:ascii="Aptos" w:hAnsi="Aptos" w:cs="Times New Roman"/>
+          <w:color w:val="211D1E"/>
+        </w:rPr>
+        <w:t>[0].address.line_</w:t>
+      </w:r>
+      <w:r>
+        <w:rPr>
+          <w:rFonts w:ascii="Aptos" w:hAnsi="Aptos" w:cs="Times New Roman"/>
+          <w:color w:val="211D1E"/>
+        </w:rPr>
+        <w:t>two</w:t>
+      </w:r>
+      <w:r>
+        <w:rPr>
+          <w:rFonts w:ascii="Aptos" w:hAnsi="Aptos" w:cs="Times New Roman"/>
+          <w:color w:val="211D1E"/>
+        </w:rPr>
+        <w:t>() }}</w:t>
+      </w:r>
+    </w:p>
+    <w:p>
+      <w:pPr>
+        <w:autoSpaceDE w:val="0"/>
+        <w:autoSpaceDN w:val="0"/>
+        <w:adjustRightInd w:val="0"/>
+        <w:spacing w:after="360"/>
+        <w:contextualSpacing/>
+        <w:rPr>
+          <w:rFonts w:ascii="Aptos" w:hAnsi="Aptos" w:cs="Times New Roman"/>
+          <w:color w:val="211D1E"/>
+        </w:rPr>
+      </w:pPr>
     </w:p>
     <w:p>
       <w:pPr>
@@ -147,7 +261,7 @@
         <w:spacing w:after="80"/>
         <w:contextualSpacing/>
         <w:rPr>
-          <w:rFonts w:ascii="Times New Roman" w:hAnsi="Times New Roman" w:cs="Times New Roman"/>
+          <w:rFonts w:ascii="Aptos" w:hAnsi="Aptos" w:cs="Times New Roman"/>
           <w:color w:val="211D1E"/>
         </w:rPr>
       </w:pPr>
@@ -160,7 +274,7 @@
         <w:spacing w:after="80"/>
         <w:contextualSpacing/>
         <w:rPr>
-          <w:rFonts w:ascii="Times New Roman" w:hAnsi="Times New Roman" w:cs="Times New Roman"/>
+          <w:rFonts w:ascii="Aptos" w:hAnsi="Aptos" w:cs="Times New Roman"/>
           <w:i/>
           <w:iCs/>
           <w:color w:val="211D1E"/>
@@ -168,49 +282,24 @@
       </w:pPr>
       <w:r>
         <w:rPr>
-          <w:rFonts w:ascii="Times New Roman" w:hAnsi="Times New Roman" w:cs="Times New Roman"/>
+          <w:rFonts w:ascii="Aptos" w:hAnsi="Aptos" w:cs="Times New Roman"/>
           <w:color w:val="211D1E"/>
         </w:rPr>
         <w:t xml:space="preserve">Dear </w:t>
       </w:r>
       <w:r>
         <w:rPr>
-          <w:rFonts w:ascii="Times New Roman" w:hAnsi="Times New Roman" w:cs="Times New Roman"/>
-          <w:color w:val="211D1E"/>
-        </w:rPr>
-        <w:t>{{ landlords[0].</w:t>
-      </w:r>
-      <w:proofErr w:type="spellStart"/>
-      <w:r>
-        <w:rPr>
-          <w:rFonts w:ascii="Times New Roman" w:hAnsi="Times New Roman" w:cs="Times New Roman"/>
-          <w:color w:val="211D1E"/>
-        </w:rPr>
-        <w:t>name.full</w:t>
-      </w:r>
-      <w:proofErr w:type="spellEnd"/>
-      <w:r>
-        <w:rPr>
-          <w:rFonts w:ascii="Times New Roman" w:hAnsi="Times New Roman" w:cs="Times New Roman"/>
-          <w:color w:val="211D1E"/>
-        </w:rPr>
-        <w:t>() }}</w:t>
-      </w:r>
-      <w:r>
-        <w:rPr>
-          <w:rFonts w:ascii="Times New Roman" w:hAnsi="Times New Roman" w:cs="Times New Roman"/>
+          <w:rFonts w:ascii="Aptos" w:hAnsi="Aptos" w:cs="Times New Roman"/>
+          <w:color w:val="211D1E"/>
+        </w:rPr>
+        <w:t>{{ landlords[0].name.full() }}</w:t>
+      </w:r>
+      <w:r>
+        <w:rPr>
+          <w:rFonts w:ascii="Aptos" w:hAnsi="Aptos" w:cs="Times New Roman"/>
           <w:color w:val="211D1E"/>
         </w:rPr>
         <w:t>:</w:t>
-      </w:r>
-      <w:r>
-        <w:rPr>
-          <w:rFonts w:ascii="Times New Roman" w:hAnsi="Times New Roman" w:cs="Times New Roman"/>
-          <w:i/>
-          <w:iCs/>
-          <w:color w:val="211D1E"/>
-        </w:rPr>
-        <w:t xml:space="preserve"> </w:t>
       </w:r>
     </w:p>
     <w:p>
@@ -221,7 +310,7 @@
         <w:spacing w:after="80"/>
         <w:contextualSpacing/>
         <w:rPr>
-          <w:rFonts w:ascii="Times New Roman" w:hAnsi="Times New Roman" w:cs="Times New Roman"/>
+          <w:rFonts w:ascii="Aptos" w:hAnsi="Aptos" w:cs="Times New Roman"/>
           <w:color w:val="211D1E"/>
         </w:rPr>
       </w:pPr>
@@ -234,143 +323,127 @@
         <w:spacing w:after="80"/>
         <w:contextualSpacing/>
         <w:rPr>
-          <w:rFonts w:ascii="Times New Roman" w:hAnsi="Times New Roman" w:cs="Times New Roman"/>
-          <w:color w:val="211D1E"/>
-        </w:rPr>
-      </w:pPr>
-      <w:r>
-        <w:rPr>
-          <w:rFonts w:ascii="Times New Roman" w:hAnsi="Times New Roman" w:cs="Times New Roman"/>
+          <w:rFonts w:ascii="Aptos" w:hAnsi="Aptos" w:cs="Times New Roman"/>
+          <w:color w:val="211D1E"/>
+        </w:rPr>
+      </w:pPr>
+      <w:r>
+        <w:rPr>
+          <w:rFonts w:ascii="Aptos" w:hAnsi="Aptos" w:cs="Times New Roman"/>
           <w:color w:val="211D1E"/>
         </w:rPr>
         <w:t xml:space="preserve">I live at </w:t>
       </w:r>
       <w:r>
         <w:rPr>
-          <w:rFonts w:ascii="Times New Roman" w:hAnsi="Times New Roman" w:cs="Times New Roman"/>
+          <w:rFonts w:ascii="Aptos" w:hAnsi="Aptos" w:cs="Times New Roman"/>
           <w:color w:val="211D1E"/>
         </w:rPr>
         <w:t>{{</w:t>
       </w:r>
       <w:r>
         <w:rPr>
-          <w:rFonts w:ascii="Times New Roman" w:hAnsi="Times New Roman" w:cs="Times New Roman"/>
+          <w:rFonts w:ascii="Aptos" w:hAnsi="Aptos" w:cs="Times New Roman"/>
           <w:color w:val="211D1E"/>
         </w:rPr>
         <w:t xml:space="preserve"> </w:t>
       </w:r>
       <w:r>
         <w:rPr>
-          <w:rFonts w:ascii="Times New Roman" w:hAnsi="Times New Roman" w:cs="Times New Roman"/>
-          <w:color w:val="211D1E"/>
-        </w:rPr>
-        <w:t>users[0].</w:t>
-      </w:r>
-      <w:proofErr w:type="spellStart"/>
-      <w:r>
-        <w:rPr>
-          <w:rFonts w:ascii="Times New Roman" w:hAnsi="Times New Roman" w:cs="Times New Roman"/>
-          <w:color w:val="211D1E"/>
-        </w:rPr>
-        <w:t>address.on_one_line</w:t>
-      </w:r>
-      <w:proofErr w:type="spellEnd"/>
-      <w:r>
-        <w:rPr>
-          <w:rFonts w:ascii="Times New Roman" w:hAnsi="Times New Roman" w:cs="Times New Roman"/>
-          <w:color w:val="211D1E"/>
-        </w:rPr>
-        <w:t>()</w:t>
-      </w:r>
-      <w:r>
-        <w:rPr>
-          <w:rFonts w:ascii="Times New Roman" w:hAnsi="Times New Roman" w:cs="Times New Roman"/>
+          <w:rFonts w:ascii="Aptos" w:hAnsi="Aptos" w:cs="Times New Roman"/>
+          <w:color w:val="211D1E"/>
+        </w:rPr>
+        <w:t>users[0].address.on_one_line()</w:t>
+      </w:r>
+      <w:r>
+        <w:rPr>
+          <w:rFonts w:ascii="Aptos" w:hAnsi="Aptos" w:cs="Times New Roman"/>
           <w:color w:val="211D1E"/>
         </w:rPr>
         <w:t xml:space="preserve"> }}</w:t>
       </w:r>
       <w:r>
         <w:rPr>
-          <w:rFonts w:ascii="Times New Roman" w:hAnsi="Times New Roman" w:cs="Times New Roman"/>
+          <w:rFonts w:ascii="Aptos" w:hAnsi="Aptos" w:cs="Times New Roman"/>
           <w:color w:val="211D1E"/>
         </w:rPr>
         <w:t xml:space="preserve">. </w:t>
       </w:r>
       <w:r>
         <w:rPr>
-          <w:rFonts w:ascii="Times New Roman" w:hAnsi="Times New Roman" w:cs="Times New Roman"/>
+          <w:rFonts w:ascii="Aptos" w:hAnsi="Aptos" w:cs="Times New Roman"/>
           <w:color w:val="211D1E"/>
         </w:rPr>
         <w:t xml:space="preserve">{{ </w:t>
       </w:r>
       <w:r>
         <w:rPr>
-          <w:rFonts w:ascii="Times New Roman" w:hAnsi="Times New Roman" w:cs="Times New Roman"/>
-          <w:color w:val="211D1E"/>
-        </w:rPr>
-        <w:t xml:space="preserve">"I am" if </w:t>
-      </w:r>
-      <w:proofErr w:type="spellStart"/>
-      <w:r>
-        <w:rPr>
-          <w:rFonts w:ascii="Times New Roman" w:hAnsi="Times New Roman" w:cs="Times New Roman"/>
-          <w:color w:val="211D1E"/>
-        </w:rPr>
-        <w:t>request_subject</w:t>
-      </w:r>
-      <w:proofErr w:type="spellEnd"/>
-      <w:r>
-        <w:rPr>
-          <w:rFonts w:ascii="Times New Roman" w:hAnsi="Times New Roman" w:cs="Times New Roman"/>
+          <w:rFonts w:ascii="Aptos" w:hAnsi="Aptos" w:cs="Times New Roman"/>
+          <w:color w:val="211D1E"/>
+        </w:rPr>
+        <w:t>"I am" if request_subject</w:t>
+      </w:r>
+      <w:r>
+        <w:rPr>
+          <w:rFonts w:ascii="Aptos" w:hAnsi="Aptos" w:cs="Times New Roman"/>
           <w:color w:val="211D1E"/>
         </w:rPr>
         <w:t xml:space="preserve"> == "</w:t>
       </w:r>
       <w:r>
         <w:rPr>
-          <w:rFonts w:ascii="Times New Roman" w:hAnsi="Times New Roman" w:cs="Times New Roman"/>
+          <w:rFonts w:ascii="Aptos" w:hAnsi="Aptos" w:cs="Times New Roman"/>
           <w:color w:val="211D1E"/>
         </w:rPr>
         <w:t xml:space="preserve">me" else </w:t>
       </w:r>
       <w:r>
         <w:rPr>
-          <w:rFonts w:ascii="Times New Roman" w:hAnsi="Times New Roman" w:cs="Times New Roman"/>
+          <w:rFonts w:ascii="Aptos" w:hAnsi="Aptos" w:cs="Times New Roman"/>
           <w:color w:val="211D1E"/>
         </w:rPr>
         <w:t xml:space="preserve">"A member of my household is" </w:t>
       </w:r>
       <w:r>
         <w:rPr>
-          <w:rFonts w:ascii="Times New Roman" w:hAnsi="Times New Roman" w:cs="Times New Roman"/>
+          <w:rFonts w:ascii="Aptos" w:hAnsi="Aptos" w:cs="Times New Roman"/>
           <w:color w:val="211D1E"/>
         </w:rPr>
         <w:t>}}</w:t>
       </w:r>
       <w:r>
         <w:rPr>
-          <w:rFonts w:ascii="Times New Roman" w:hAnsi="Times New Roman" w:cs="Times New Roman"/>
-          <w:color w:val="211D1E"/>
-        </w:rPr>
-        <w:t xml:space="preserve"> a person with a disability as defined by the Fair Housing Act. I am writing to request reasonable accommodation</w:t>
-      </w:r>
-      <w:r>
-        <w:rPr>
-          <w:rFonts w:ascii="Times New Roman" w:hAnsi="Times New Roman" w:cs="Times New Roman"/>
+          <w:rFonts w:ascii="Aptos" w:hAnsi="Aptos" w:cs="Times New Roman"/>
+          <w:color w:val="211D1E"/>
+        </w:rPr>
+        <w:t xml:space="preserve"> a person with a disability as defined by the Fair Housing Act. I am writing to request reasonable </w:t>
+      </w:r>
+      <w:proofErr w:type="gramStart"/>
+      <w:r>
+        <w:rPr>
+          <w:rFonts w:ascii="Aptos" w:hAnsi="Aptos" w:cs="Times New Roman"/>
+          <w:color w:val="211D1E"/>
+        </w:rPr>
+        <w:t>accommodation</w:t>
+      </w:r>
+      <w:r>
+        <w:rPr>
+          <w:rFonts w:ascii="Aptos" w:hAnsi="Aptos" w:cs="Times New Roman"/>
           <w:color w:val="211D1E"/>
         </w:rPr>
         <w:t>s</w:t>
       </w:r>
-      <w:r>
-        <w:rPr>
-          <w:rFonts w:ascii="Times New Roman" w:hAnsi="Times New Roman" w:cs="Times New Roman"/>
-          <w:color w:val="211D1E"/>
-        </w:rPr>
-        <w:t xml:space="preserve"> under the federal Fair Housing Act. </w:t>
-      </w:r>
-      <w:r>
-        <w:rPr>
-          <w:rFonts w:ascii="Times New Roman" w:hAnsi="Times New Roman" w:cs="Times New Roman"/>
+      <w:proofErr w:type="gramEnd"/>
+      <w:r>
+        <w:rPr>
+          <w:rFonts w:ascii="Aptos" w:hAnsi="Aptos" w:cs="Times New Roman"/>
+          <w:color w:val="211D1E"/>
+        </w:rPr>
+        <w:t xml:space="preserve"> under the federal Fair Housing Act.</w:t>
+      </w:r>
+      <w:r>
+        <w:rPr>
+          <w:rFonts w:ascii="Aptos" w:hAnsi="Aptos" w:cs="Times New Roman"/>
           <w:color w:val="211D1E"/>
         </w:rPr>
         <w:br/>
@@ -383,14 +456,34 @@
         <w:adjustRightInd w:val="0"/>
         <w:contextualSpacing/>
         <w:rPr>
-          <w:rFonts w:ascii="Times New Roman" w:hAnsi="Times New Roman" w:cs="Times New Roman"/>
-          <w:color w:val="211D1E"/>
-        </w:rPr>
-      </w:pPr>
-      <w:r>
+          <w:rFonts w:ascii="Aptos" w:hAnsi="Aptos" w:cs="Times New Roman"/>
+          <w:color w:val="211D1E"/>
+        </w:rPr>
+      </w:pPr>
+      <w:r>
+        <w:rPr>
+          <w:rFonts w:ascii="Aptos" w:hAnsi="Aptos"/>
+        </w:rPr>
         <w:t>{{ request_body }}</w:t>
+      </w:r>
+      <w:r>
+        <w:rPr>
+          <w:rFonts w:ascii="Aptos" w:hAnsi="Aptos"/>
+        </w:rPr>
         <w:br/>
-        <w:t xml:space="preserve">According to the Fair Housing Act Amendments Sec. 804 (42 U.S.C. 3604) (f)(3)(B), (3) For purposes of this subsection, discrimination includes-- (B) a refusal to make reasonable accommodations in rules, policies, practices, or services, when such accommodations may be necessary to afford such person equal opportunity to use and enjoy a dwelling. </w:t>
+        <w:t>According to the Fair Housing Act Amendments Sec. 804 (42 U.S.C. 3604) (f)(3)(B), (3) For purposes of this subsection, discrimination includes</w:t>
+      </w:r>
+      <w:r>
+        <w:rPr>
+          <w:rFonts w:ascii="Aptos" w:hAnsi="Aptos"/>
+        </w:rPr>
+        <w:t xml:space="preserve">: </w:t>
+      </w:r>
+      <w:r>
+        <w:rPr>
+          <w:rFonts w:ascii="Aptos" w:hAnsi="Aptos"/>
+        </w:rPr>
+        <w:t xml:space="preserve"> (B) a refusal to make reasonable accommodations in rules, policies, practices, or services, when such accommodations may be necessary to afford such person equal opportunity to use and enjoy a dwelling.</w:t>
       </w:r>
     </w:p>
     <w:p>
@@ -401,7 +494,7 @@
         <w:spacing w:after="80"/>
         <w:contextualSpacing/>
         <w:rPr>
-          <w:rFonts w:ascii="Times New Roman" w:hAnsi="Times New Roman" w:cs="Times New Roman"/>
+          <w:rFonts w:ascii="Aptos" w:hAnsi="Aptos" w:cs="Times New Roman"/>
           <w:color w:val="211D1E"/>
         </w:rPr>
       </w:pPr>
@@ -414,16 +507,16 @@
         <w:spacing w:after="80"/>
         <w:contextualSpacing/>
         <w:rPr>
-          <w:rFonts w:ascii="Times New Roman" w:hAnsi="Times New Roman" w:cs="Times New Roman"/>
-          <w:color w:val="211D1E"/>
-        </w:rPr>
-      </w:pPr>
-      <w:r>
-        <w:rPr>
-          <w:rFonts w:ascii="Times New Roman" w:hAnsi="Times New Roman" w:cs="Times New Roman"/>
-          <w:color w:val="211D1E"/>
-        </w:rPr>
-        <w:t xml:space="preserve">You can refer to the Joint Statement from the U.S. Department of Housing and Urban Development and the Department of Justice detailing the obligations of housing providers under the Fair Housing Act to make reasonable accommodations for persons with disabilities. You can access this Joint Statement by visiting equalhousing.org and clicking on the Landlord Resource Center. </w:t>
+          <w:rFonts w:ascii="Aptos" w:hAnsi="Aptos" w:cs="Times New Roman"/>
+          <w:color w:val="211D1E"/>
+        </w:rPr>
+      </w:pPr>
+      <w:r>
+        <w:rPr>
+          <w:rFonts w:ascii="Aptos" w:hAnsi="Aptos" w:cs="Times New Roman"/>
+          <w:color w:val="211D1E"/>
+        </w:rPr>
+        <w:t>You can refer to the Joint Statement from the U.S. Department of Housing and Urban Development and the Department of Justice detailing the obligations of housing providers under the Fair Housing Act to make reasonable accommodations for persons with disabilities. You can access this Joint Statement by visiting equalhousing.org and clicking on the Landlord Resource Center.</w:t>
       </w:r>
     </w:p>
     <w:p>
@@ -434,7 +527,7 @@
         <w:spacing w:after="360"/>
         <w:contextualSpacing/>
         <w:rPr>
-          <w:rFonts w:ascii="Times New Roman" w:hAnsi="Times New Roman" w:cs="Times New Roman"/>
+          <w:rFonts w:ascii="Aptos" w:hAnsi="Aptos" w:cs="Times New Roman"/>
           <w:color w:val="211D1E"/>
         </w:rPr>
       </w:pPr>
@@ -447,12 +540,15 @@
         <w:spacing w:after="360"/>
         <w:contextualSpacing/>
         <w:rPr>
-          <w:rFonts w:ascii="Times New Roman" w:hAnsi="Times New Roman" w:cs="Times New Roman"/>
-          <w:color w:val="211D1E"/>
-        </w:rPr>
-      </w:pPr>
-      <w:r>
-        <w:t xml:space="preserve">Please respond in writing to my request within 10 days from the date of this letter. I look forward to your response and appreciate your attention to this critical matter. </w:t>
+          <w:rFonts w:ascii="Aptos" w:hAnsi="Aptos" w:cs="Times New Roman"/>
+          <w:color w:val="211D1E"/>
+        </w:rPr>
+      </w:pPr>
+      <w:r>
+        <w:rPr>
+          <w:rFonts w:ascii="Aptos" w:hAnsi="Aptos"/>
+        </w:rPr>
+        <w:t>Please respond in writing to my request within 10 days from the date of this letter. I look forward to your response and appreciate your attention to this critical matter.</w:t>
       </w:r>
     </w:p>
     <w:p>
@@ -463,7 +559,7 @@
         <w:spacing w:after="80"/>
         <w:contextualSpacing/>
         <w:rPr>
-          <w:rFonts w:ascii="Times New Roman" w:hAnsi="Times New Roman" w:cs="Times New Roman"/>
+          <w:rFonts w:ascii="Aptos" w:hAnsi="Aptos" w:cs="Times New Roman"/>
           <w:color w:val="211D1E"/>
         </w:rPr>
       </w:pPr>
@@ -476,13 +572,13 @@
         <w:spacing w:after="80"/>
         <w:contextualSpacing/>
         <w:rPr>
-          <w:rFonts w:ascii="Times New Roman" w:hAnsi="Times New Roman" w:cs="Times New Roman"/>
-          <w:color w:val="211D1E"/>
-        </w:rPr>
-      </w:pPr>
-      <w:r>
-        <w:rPr>
-          <w:rFonts w:ascii="Times New Roman" w:hAnsi="Times New Roman" w:cs="Times New Roman"/>
+          <w:rFonts w:ascii="Aptos" w:hAnsi="Aptos" w:cs="Times New Roman"/>
+          <w:color w:val="211D1E"/>
+        </w:rPr>
+      </w:pPr>
+      <w:r>
+        <w:rPr>
+          <w:rFonts w:ascii="Aptos" w:hAnsi="Aptos" w:cs="Times New Roman"/>
           <w:color w:val="211D1E"/>
         </w:rPr>
         <w:t xml:space="preserve">Sincerely, </w:t>
@@ -492,41 +588,41 @@
       <w:pPr>
         <w:contextualSpacing/>
         <w:rPr>
-          <w:rFonts w:ascii="Times New Roman" w:hAnsi="Times New Roman" w:cs="Times New Roman"/>
-          <w:color w:val="211D1E"/>
-        </w:rPr>
-      </w:pPr>
-      <w:r>
-        <w:rPr>
-          <w:rFonts w:ascii="Times New Roman" w:hAnsi="Times New Roman" w:cs="Times New Roman"/>
+          <w:rFonts w:ascii="Aptos" w:hAnsi="Aptos" w:cs="Times New Roman"/>
+          <w:color w:val="211D1E"/>
+        </w:rPr>
+      </w:pPr>
+      <w:r>
+        <w:rPr>
+          <w:rFonts w:ascii="Aptos" w:hAnsi="Aptos" w:cs="Times New Roman"/>
           <w:color w:val="211D1E"/>
         </w:rPr>
         <w:t>{{ users[</w:t>
       </w:r>
       <w:r>
         <w:rPr>
-          <w:rFonts w:ascii="Times New Roman" w:hAnsi="Times New Roman" w:cs="Times New Roman"/>
+          <w:rFonts w:ascii="Aptos" w:hAnsi="Aptos" w:cs="Times New Roman"/>
           <w:color w:val="211D1E"/>
         </w:rPr>
         <w:t>0</w:t>
       </w:r>
       <w:r>
         <w:rPr>
-          <w:rFonts w:ascii="Times New Roman" w:hAnsi="Times New Roman" w:cs="Times New Roman"/>
+          <w:rFonts w:ascii="Aptos" w:hAnsi="Aptos" w:cs="Times New Roman"/>
           <w:color w:val="211D1E"/>
         </w:rPr>
         <w:t>]</w:t>
       </w:r>
       <w:r>
         <w:rPr>
-          <w:rFonts w:ascii="Times New Roman" w:hAnsi="Times New Roman" w:cs="Times New Roman"/>
+          <w:rFonts w:ascii="Aptos" w:hAnsi="Aptos" w:cs="Times New Roman"/>
           <w:color w:val="211D1E"/>
         </w:rPr>
         <w:t>.signature }}</w:t>
       </w:r>
       <w:r>
         <w:rPr>
-          <w:rFonts w:ascii="Times New Roman" w:hAnsi="Times New Roman" w:cs="Times New Roman"/>
+          <w:rFonts w:ascii="Aptos" w:hAnsi="Aptos" w:cs="Times New Roman"/>
           <w:color w:val="211D1E"/>
         </w:rPr>
         <w:br/>
@@ -536,14 +632,91 @@
       <w:pPr>
         <w:contextualSpacing/>
         <w:rPr>
-          <w:rFonts w:ascii="Times New Roman" w:hAnsi="Times New Roman" w:cs="Times New Roman"/>
-          <w:color w:val="211D1E"/>
-        </w:rPr>
-      </w:pPr>
-      <w:r>
+          <w:rFonts w:ascii="Aptos" w:hAnsi="Aptos"/>
+        </w:rPr>
+      </w:pPr>
+      <w:r>
+        <w:rPr>
+          <w:rFonts w:ascii="Aptos" w:hAnsi="Aptos"/>
+        </w:rPr>
         <w:t>{{ users[0].name.full() }}</w:t>
+      </w:r>
+      <w:r>
+        <w:rPr>
+          <w:rFonts w:ascii="Aptos" w:hAnsi="Aptos"/>
+        </w:rPr>
         <w:br/>
-        <w:t>Phone: {{ users[0].phone_number }}</w:t>
+        <w:t>{{ users[0].phone_number }}</w:t>
+      </w:r>
+    </w:p>
+    <w:p>
+      <w:pPr>
+        <w:contextualSpacing/>
+        <w:rPr>
+          <w:rFonts w:ascii="Aptos" w:hAnsi="Aptos" w:cs="Times New Roman"/>
+          <w:color w:val="211D1E"/>
+        </w:rPr>
+      </w:pPr>
+      <w:r>
+        <w:rPr>
+          <w:rFonts w:ascii="Aptos" w:hAnsi="Aptos"/>
+        </w:rPr>
+        <w:t xml:space="preserve">{{ </w:t>
+      </w:r>
+      <w:r>
+        <w:rPr>
+          <w:rFonts w:ascii="Aptos" w:hAnsi="Aptos" w:cs="Times New Roman"/>
+          <w:color w:val="211D1E"/>
+        </w:rPr>
+        <w:t>users1_work_phone_number</w:t>
+      </w:r>
+      <w:r>
+        <w:rPr>
+          <w:rFonts w:ascii="Aptos" w:hAnsi="Aptos" w:cs="Times New Roman"/>
+          <w:color w:val="211D1E"/>
+        </w:rPr>
+        <w:t xml:space="preserve"> </w:t>
+      </w:r>
+      <w:r>
+        <w:rPr>
+          <w:rFonts w:ascii="Aptos" w:hAnsi="Aptos"/>
+        </w:rPr>
+        <w:t>}}</w:t>
+      </w:r>
+    </w:p>
+    <w:p>
+      <w:pPr>
+        <w:contextualSpacing/>
+        <w:rPr>
+          <w:rFonts w:ascii="Aptos" w:hAnsi="Aptos" w:cs="Times New Roman"/>
+          <w:color w:val="211D1E"/>
+        </w:rPr>
+      </w:pPr>
+      <w:r>
+        <w:rPr>
+          <w:rFonts w:ascii="Aptos" w:hAnsi="Aptos"/>
+        </w:rPr>
+        <w:t>{{</w:t>
+      </w:r>
+      <w:r>
+        <w:rPr>
+          <w:rFonts w:ascii="Aptos" w:hAnsi="Aptos" w:cs="Times New Roman"/>
+          <w:color w:val="211D1E"/>
+        </w:rPr>
+        <w:t xml:space="preserve"> users[0].email</w:t>
+      </w:r>
+      <w:r>
+        <w:rPr>
+          <w:rFonts w:ascii="Aptos" w:hAnsi="Aptos" w:cs="Times New Roman"/>
+          <w:color w:val="211D1E"/>
+        </w:rPr>
+        <w:t xml:space="preserve"> </w:t>
+      </w:r>
+      <w:r>
+        <w:rPr>
+          <w:rFonts w:ascii="Aptos" w:hAnsi="Aptos"/>
+        </w:rPr>
+        <w:t>}}</w:t>
       </w:r>
     </w:p>
     <w:sectPr>
@@ -955,7 +1128,6 @@
   <w:style w:type="character" w:default="1" w:styleId="DefaultParagraphFont">
     <w:name w:val="Default Paragraph Font"/>
     <w:uiPriority w:val="1"/>
-    <w:semiHidden/>
     <w:unhideWhenUsed/>
   </w:style>
   <w:style w:type="table" w:default="1" w:styleId="TableNormal">

</xml_diff>